<commit_message>
build(profiles): strip theme font links in reference-doc builders; regenerate
A w:asciiTheme attribute on a style rFonts outranks the literal w:ascii, so
the theme-linked Heading 1-3 of pandoc default reference doc rendered in
Aptos under the default house style. The builders now set all four rFonts
slots literally and drop the theme attributes, and look styles up by exact
name instead of the deprecated style-id fallback. All seven reference.docx
assets regenerated by their sibling scripts (styles.xml rFonts lines only);
kist-wcr renders stay byte-identical (T-0015).

Co-Authored-By: Claude Fable 5.1 <noreply@anthropic.com>
</commit_message>
<xml_diff>
--- a/src/wongo/profiles/envmicrobiome/assets/reference.docx
+++ b/src/wongo/profiles/envmicrobiome/assets/reference.docx
@@ -502,7 +502,7 @@
     <w:name w:val="Normal"/>
     <w:qFormat/>
     <w:rPr>
-      <w:rFonts w:ascii="Times New Roman" w:hAnsi="Times New Roman"/>
+      <w:rFonts w:ascii="Times New Roman" w:hAnsi="Times New Roman" w:eastAsia="Times New Roman" w:cs="Times New Roman"/>
       <w:sz w:val="24"/>
     </w:rPr>
   </w:style>
@@ -677,7 +677,7 @@
       <w:outlineLvl w:val="0"/>
     </w:pPr>
     <w:rPr>
-      <w:rFonts w:asciiTheme="majorHAnsi" w:eastAsiaTheme="majorEastAsia" w:hAnsiTheme="majorHAnsi" w:cstheme="majorBidi" w:ascii="Times New Roman" w:hAnsi="Times New Roman"/>
+      <w:rFonts w:ascii="Times New Roman" w:hAnsi="Times New Roman" w:eastAsia="Times New Roman" w:cs="Times New Roman"/>
       <w:b/>
       <w:i w:val="0"/>
       <w:color w:val="000000"/>
@@ -702,7 +702,7 @@
       <w:outlineLvl w:val="1"/>
     </w:pPr>
     <w:rPr>
-      <w:rFonts w:asciiTheme="majorHAnsi" w:eastAsiaTheme="majorEastAsia" w:hAnsiTheme="majorHAnsi" w:cstheme="majorBidi" w:ascii="Times New Roman" w:hAnsi="Times New Roman"/>
+      <w:rFonts w:ascii="Times New Roman" w:hAnsi="Times New Roman" w:eastAsia="Times New Roman" w:cs="Times New Roman"/>
       <w:b/>
       <w:i w:val="0"/>
       <w:color w:val="000000"/>
@@ -727,7 +727,7 @@
       <w:outlineLvl w:val="2"/>
     </w:pPr>
     <w:rPr>
-      <w:rFonts w:eastAsiaTheme="majorEastAsia" w:cstheme="majorBidi" w:ascii="Times New Roman" w:hAnsi="Times New Roman"/>
+      <w:rFonts w:ascii="Times New Roman" w:hAnsi="Times New Roman" w:eastAsia="Times New Roman" w:cs="Times New Roman"/>
       <w:b w:val="0"/>
       <w:i/>
       <w:color w:val="000000"/>
@@ -1072,7 +1072,7 @@
       <w:spacing w:before="0" w:after="120"/>
     </w:pPr>
     <w:rPr>
-      <w:rFonts w:ascii="Times New Roman" w:hAnsi="Times New Roman"/>
+      <w:rFonts w:ascii="Times New Roman" w:hAnsi="Times New Roman" w:eastAsia="Times New Roman" w:cs="Times New Roman"/>
       <w:i w:val="0"/>
       <w:color w:val="000000"/>
       <w:sz w:val="20"/>
@@ -1085,7 +1085,7 @@
       <w:keepNext/>
     </w:pPr>
     <w:rPr>
-      <w:rFonts w:ascii="Times New Roman" w:hAnsi="Times New Roman"/>
+      <w:rFonts w:ascii="Times New Roman" w:hAnsi="Times New Roman" w:eastAsia="Times New Roman" w:cs="Times New Roman"/>
       <w:i w:val="0"/>
       <w:color w:val="000000"/>
       <w:sz w:val="20"/>
@@ -1095,7 +1095,7 @@
     <w:name w:val="Image Caption"/>
     <w:basedOn w:val="Caption"/>
     <w:rPr>
-      <w:rFonts w:ascii="Times New Roman" w:hAnsi="Times New Roman"/>
+      <w:rFonts w:ascii="Times New Roman" w:hAnsi="Times New Roman" w:eastAsia="Times New Roman" w:cs="Times New Roman"/>
       <w:i w:val="0"/>
       <w:color w:val="000000"/>
       <w:sz w:val="20"/>

</xml_diff>